<commit_message>
Rebrand Priozersk ads: КлинкерПрофи only, no Marmara PRO
Rename campaign to КлинкерПрофи — термопанели, Приозерский район (CPA).
Update headlines, visit card, and docx exports.

Co-authored-by: Igor-Lark <Igor-Lark@users.noreply.github.com>
</commit_message>
<xml_diff>
--- a/ads/marmara-pro/termopaneli-priozersky-campaign-cpa.docx
+++ b/ads/marmara-pro/termopaneli-priozersky-campaign-cpa.docx
@@ -7,29 +7,29 @@
         <w:pStyle w:val="Heading1"/>
       </w:pPr>
       <w:r>
-        <w:t>Кампания: Термопанели — Приозерский район (CPA)</w:t>
+        <w:t>Кампания: КлинкерПрофи — термопанели, Приозерский район (CPA)</w:t>
       </w:r>
     </w:p>
-    <w:p/>
     <w:p>
       <w:r>
-        <w:t>Отдельная **поисковая** рекламная кампания в Яндекс Директе для фасадных термопанелей **Marmara PRO / КлинкерПрофи** с гео **только Приозерский район** Ленинградской области.</w:t>
+        <w:t>Отдельная **поисковая** рекламная кампания в Яндекс Директе для фасадных термопанелей **КлинкерПрофи** с гео **только Приозерский район** Ленинградской области.</w:t>
       </w:r>
     </w:p>
-    <w:p/>
     <w:p>
       <w:r>
         <w:t>**Стратегия:** «Максимум конверсий» + **оплата за конверсии** (платите за достижение целей в Метрике, а не за клики).</w:t>
       </w:r>
     </w:p>
-    <w:p/>
+    <w:p>
+      <w:r>
+        <w:t>**Бренд в рекламе:** только **КлинкерПрофи** (названия Marmara PRO / «Мармара Про» в кампаниях и объявлениях не используем). Домен сайта `marmara-pro.ru` — технический, в текстах не упоминаем.</w:t>
+      </w:r>
+    </w:p>
     <w:p>
       <w:r>
         <w:t>Для группы объявлений внутри общей кампании с ручными ставками см. [`termopaneli-priozersky-adgroup.md`](termopaneli-priozersky-adgroup.md). Этот документ — **самостоятельная кампания**, не добавление группы в старую кампанию.</w:t>
       </w:r>
     </w:p>
-    <w:p/>
-    <w:p/>
     <w:p>
       <w:pPr>
         <w:pStyle w:val="Heading2"/>
@@ -38,7 +38,6 @@
         <w:t>Сводка настроек</w:t>
       </w:r>
     </w:p>
-    <w:p/>
     <w:p>
       <w:r>
         <w:t>| Параметр | Значение |</w:t>
@@ -51,7 +50,7 @@
     </w:p>
     <w:p>
       <w:r>
-        <w:t>| **Название кампании** | `Термопанели — Приозерский район (CPA)` |</w:t>
+        <w:t>| **Название кампании** | `КлинкерПрофи — термопанели, Приозерский район (CPA)` |</w:t>
       </w:r>
     </w:p>
     <w:p>
@@ -94,7 +93,6 @@
         <w:t>| **Цены в объявлениях** | Не указывать |</w:t>
       </w:r>
     </w:p>
-    <w:p/>
     <w:p>
       <w:pPr>
         <w:pStyle w:val="Heading3"/>
@@ -103,25 +101,21 @@
         <w:t>UTM (уровень кампании)</w:t>
       </w:r>
     </w:p>
-    <w:p/>
     <w:p>
       <w:r>
         <w:t>В **Настройки кампании → URL-параметры** (или в ссылках объявлений):</w:t>
       </w:r>
     </w:p>
-    <w:p/>
     <w:p>
       <w:r>
         <w:t>utm_source=yandex&amp;utm_medium=cpc&amp;utm_campaign=termopaneli_priozersk_cpa&amp;utm_content=search&amp;utm_term={keyword}</w:t>
       </w:r>
     </w:p>
-    <w:p/>
     <w:p>
       <w:r>
         <w:t>Файлы импорта с этими метками:</w:t>
       </w:r>
     </w:p>
-    <w:p/>
     <w:p>
       <w:r>
         <w:t>- [`termopaneli-priozersky-campaign-cpa-keywords.csv`](termopaneli-priozersky-campaign-cpa-keywords.csv)</w:t>
@@ -132,8 +126,6 @@
         <w:t>- [`termopaneli-priozersky-campaign-cpa-ads.csv`](termopaneli-priozersky-campaign-cpa-ads.csv)</w:t>
       </w:r>
     </w:p>
-    <w:p/>
-    <w:p/>
     <w:p>
       <w:pPr>
         <w:pStyle w:val="Heading2"/>
@@ -142,7 +134,6 @@
         <w:t>Предварительные условия (обязательно до запуска CPA)</w:t>
       </w:r>
     </w:p>
-    <w:p/>
     <w:p>
       <w:r>
         <w:t>1. **Яндекс Метрика** на `marmara-pro.ru` (Tilda: счётчик в настройках сайта, на всех страницах).</w:t>
@@ -158,7 +149,6 @@
         <w:t>3. **Цели** (отдельные, с понятными названиями для отчётов):</w:t>
       </w:r>
     </w:p>
-    <w:p/>
     <w:p>
       <w:r>
         <w:t>| Цель | Как настроить | Роль в кампании |</w:t>
@@ -179,7 +169,6 @@
         <w:t>| **Клик по телефону** | Цель «Клик по номеру телефона» или JS на `tel:+79217457755` | Доп. конверсия (звонки с мобильных) |</w:t>
       </w:r>
     </w:p>
-    <w:p/>
     <w:p>
       <w:r>
         <w:t>4. **Проверка:** в Метрике → «Отчёты» / «Конверсии» — цели срабатывают при тестовой заявке и тестовом клике по телефону.</w:t>
@@ -190,14 +179,11 @@
         <w:t>5. **Атрибуция:** для старта оставьте **«Последний значимый переход»** или рекомендуемую Директом модель; **не меняйте** модель и состав целей первые 1–2 недели после запуска (сбрасывает обучение).</w:t>
       </w:r>
     </w:p>
-    <w:p/>
     <w:p>
       <w:r>
         <w:t>**Оплата за конверсии:** списание за конверсии, произошедшие **в течение 21 дня** после клика по объявлению ([справка Директа](https://yandex.com/support/direct/ru/strategies/average-cpa-conversions)).</w:t>
       </w:r>
     </w:p>
-    <w:p/>
-    <w:p/>
     <w:p>
       <w:pPr>
         <w:pStyle w:val="Heading2"/>
@@ -206,7 +192,6 @@
         <w:t>Стратегия «Максимум конверсий» + оплата за конверсии</w:t>
       </w:r>
     </w:p>
-    <w:p/>
     <w:p>
       <w:pPr>
         <w:pStyle w:val="Heading3"/>
@@ -215,7 +200,6 @@
         <w:t>Шаги в интерфейсе</w:t>
       </w:r>
     </w:p>
-    <w:p/>
     <w:p>
       <w:r>
         <w:t>1. Создать кампанию → **Поиск** → **Режим эксперта**.</w:t>
@@ -223,7 +207,7 @@
     </w:p>
     <w:p>
       <w:r>
-        <w:t>2. Название: `Термопанели — Приозерский район (CPA)`.</w:t>
+        <w:t>2. Название: `КлинкерПрофи — термопанели, Приозерский район (CPA)`.</w:t>
       </w:r>
     </w:p>
     <w:p>
@@ -266,7 +250,6 @@
         <w:t>6. Сохранить кампанию.</w:t>
       </w:r>
     </w:p>
-    <w:p/>
     <w:p>
       <w:pPr>
         <w:pStyle w:val="Heading3"/>
@@ -275,13 +258,11 @@
         <w:t>Рекомендуемые CPA и бюджет (стартовые, скорректировать по факту)</w:t>
       </w:r>
     </w:p>
-    <w:p/>
     <w:p>
       <w:r>
         <w:t>Для ниши «термопанели / B2C–малый B2B», узкое гео:</w:t>
       </w:r>
     </w:p>
-    <w:p/>
     <w:p>
       <w:r>
         <w:t>| Цель | Стартовая цена конверсии (макс.) | Комментарий |</w:t>
@@ -302,13 +283,11 @@
         <w:t>| Клик по телефону | **400–800 ₽** | Часто дешевле заявки; не дублируйте одного клиента в отчётах без сквозной аналитики |</w:t>
       </w:r>
     </w:p>
-    <w:p/>
     <w:p>
       <w:r>
         <w:t>**Недельный бюджет** (правило Директа: ≥ **10 ×** цена конверсии):</w:t>
       </w:r>
     </w:p>
-    <w:p/>
     <w:p>
       <w:r>
         <w:t>| Сценарий | CPA заявки | Мин. недельный бюджет |</w:t>
@@ -334,13 +313,11 @@
         <w:t>| Только заявка, агрессивный тест | 2 000 ₽ | **20 000 ₽/нед** |</w:t>
       </w:r>
     </w:p>
-    <w:p/>
     <w:p>
       <w:r>
         <w:t>Если выбраны **две цели**, недельного бюджета должно хватать минимум на **10 конверсий в сумме** по кампании в неделю — иначе алгоритм «голодает» и режет показы.</w:t>
       </w:r>
     </w:p>
-    <w:p/>
     <w:p>
       <w:pPr>
         <w:pStyle w:val="Heading3"/>
@@ -349,7 +326,6 @@
         <w:t>Если конверсий мало (&lt; ~10 в неделю по кампании)</w:t>
       </w:r>
     </w:p>
-    <w:p/>
     <w:p>
       <w:r>
         <w:t>1. **Этап 0 (1–3 недели):** та же кампания и гео, стратегия **«Максимум конверсий»**, но модель оплаты **за клики** + недельный бюджет 8 000–12 000 ₽. Алгоритм учится на целях, вы платите за клики.</w:t>
@@ -365,14 +341,11 @@
         <w:t>3. Альтернатива: временно расширить гео до **Ленобласти** с **−100 %** ставки вне Приозерского района (сложнее в эксперте; проще держать узкое гео и терпеть малый объём).</w:t>
       </w:r>
     </w:p>
-    <w:p/>
     <w:p>
       <w:r>
         <w:t>**Не менять** каждые 2–3 дня: цели, CPA, атрибуцию, модель оплаты — это перезапускает обучение.</w:t>
       </w:r>
     </w:p>
-    <w:p/>
-    <w:p/>
     <w:p>
       <w:pPr>
         <w:pStyle w:val="Heading2"/>
@@ -381,19 +354,16 @@
         <w:t>Геотargeting</w:t>
       </w:r>
     </w:p>
-    <w:p/>
     <w:p>
       <w:r>
         <w:t>**Регион показа кампании:** Приозерский район, Ленинградская область.</w:t>
       </w:r>
     </w:p>
-    <w:p/>
     <w:p>
       <w:r>
         <w:t>**Корректировки ставок по НП (+15…+35 %)** — опционально, стратегия CPA сама повышает ставки на конверсионную аудиторию; имеет смысл только если в интерфейсе остаётся ручная надстройка:</w:t>
       </w:r>
     </w:p>
-    <w:p/>
     <w:p>
       <w:r>
         <w:t>| Населённый пункт |</w:t>
@@ -439,20 +409,16 @@
         <w:t>| Синявино |</w:t>
       </w:r>
     </w:p>
-    <w:p/>
     <w:p>
       <w:r>
         <w:t>**Мобильные:** +10…+15 % (звонки и формы с телефона).</w:t>
       </w:r>
     </w:p>
-    <w:p/>
     <w:p>
       <w:r>
         <w:t>Производство — **г. Выборг**. В текстах: «производство в Ленобласти», «доставка по области»; **не** обещать бесплатную доставку в Приозерский район (в FAQ бесплатная доставка — для Выборгского района).</w:t>
       </w:r>
     </w:p>
-    <w:p/>
-    <w:p/>
     <w:p>
       <w:pPr>
         <w:pStyle w:val="Heading2"/>
@@ -461,13 +427,11 @@
         <w:t>Структура кампании</w:t>
       </w:r>
     </w:p>
-    <w:p/>
     <w:p>
       <w:r>
         <w:t>Одна кампания, **одна группа объявлений** (достаточно для узкого гео):</w:t>
       </w:r>
     </w:p>
-    <w:p/>
     <w:p>
       <w:r>
         <w:t>| Группа | Содержание |</w:t>
@@ -483,14 +447,11 @@
         <w:t>| **Приозерский район** | Ключи + 5 объявлений из CSV / раздела ниже |</w:t>
       </w:r>
     </w:p>
-    <w:p/>
     <w:p>
       <w:r>
         <w:t>При росте бюджета можно разделить на две группы: «Гео — Приозерск» и «Общие коммерческие» (те же ключи, что в [`termopaneli-priozersky-adgroup.md`](termopaneli-priozersky-adgroup.md)).</w:t>
       </w:r>
     </w:p>
-    <w:p/>
-    <w:p/>
     <w:p>
       <w:pPr>
         <w:pStyle w:val="Heading2"/>
@@ -499,26 +460,21 @@
         <w:t>Ключевые фразы и минус-слова</w:t>
       </w:r>
     </w:p>
-    <w:p/>
     <w:p>
       <w:r>
         <w:t>Полный список и импорт: [`termopaneli-priozersky-campaign-cpa-keywords.csv`](termopaneli-priozersky-campaign-cpa-keywords.csv) (совпадает с группой Приозерский район из adgroup-спецификации).</w:t>
       </w:r>
     </w:p>
-    <w:p/>
     <w:p>
       <w:r>
         <w:t>**Минус-слова на уровне кампании** — скопировать из раздела «Минус-слова» в [`termopaneli-priozersky-adgroup.md`](termopaneli-priozersky-adgroup.md) (общий список + доп. для района).</w:t>
       </w:r>
     </w:p>
-    <w:p/>
     <w:p>
       <w:r>
         <w:t>При стратегии CPA **ставки в CSV не задаются** — оставьте поле пустым.</w:t>
       </w:r>
     </w:p>
-    <w:p/>
-    <w:p/>
     <w:p>
       <w:pPr>
         <w:pStyle w:val="Heading2"/>
@@ -527,19 +483,16 @@
         <w:t>Объявления</w:t>
       </w:r>
     </w:p>
-    <w:p/>
     <w:p>
       <w:r>
         <w:t>Импорт: [`termopaneli-priozersky-campaign-cpa-ads.csv`](termopaneli-priozersky-campaign-cpa-ads.csv).</w:t>
       </w:r>
     </w:p>
-    <w:p/>
     <w:p>
       <w:r>
         <w:t>Тексты — те же 5 объявлений, **без цен**. Расширения на **уровне кампании:**</w:t>
       </w:r>
     </w:p>
-    <w:p/>
     <w:p>
       <w:r>
         <w:t>- **Быстрые ссылки:** каталог `/termo`, монтаж, контакты, `tel:+79217457755`</w:t>
@@ -552,11 +505,9 @@
     </w:p>
     <w:p>
       <w:r>
-        <w:t>- **Визитка:** Marmara PRO / КлинкерПрофи, +7 (921) 745-77-55, г. Выборг, ул. Ленина, 11</w:t>
+        <w:t>- **Визитка:** КлинкерПрофи, +7 (921) 745-77-55, г. Выборг, ул. Ленина, 11</w:t>
       </w:r>
     </w:p>
-    <w:p/>
-    <w:p/>
     <w:p>
       <w:pPr>
         <w:pStyle w:val="Heading2"/>
@@ -565,7 +516,6 @@
         <w:t>Пошаговый запуск в Директе</w:t>
       </w:r>
     </w:p>
-    <w:p/>
     <w:p>
       <w:r>
         <w:t>1. Выполнить блок **«Предварительные условия»**.</w:t>
@@ -606,8 +556,6 @@
         <w:t>8. **Еженедельно:** Директ → «Поисковые запросы» → минус-слова; Метрика → цели по UTM `termopaneli_priozersk_cpa`.</w:t>
       </w:r>
     </w:p>
-    <w:p/>
-    <w:p/>
     <w:p>
       <w:pPr>
         <w:pStyle w:val="Heading2"/>
@@ -616,7 +564,6 @@
         <w:t>Контроль эффективности</w:t>
       </w:r>
     </w:p>
-    <w:p/>
     <w:p>
       <w:r>
         <w:t>| Метрика | Где смотреть | Ориентир |</w:t>
@@ -642,8 +589,6 @@
         <w:t>| Качество лидов | CRM / звонки | Если лиды «мусорные» — минус-слова + ужесточить ключи (убрать широкие «термопанели») |</w:t>
       </w:r>
     </w:p>
-    <w:p/>
-    <w:p/>
     <w:p>
       <w:pPr>
         <w:pStyle w:val="Heading2"/>
@@ -652,7 +597,6 @@
         <w:t>Связанные файлы</w:t>
       </w:r>
     </w:p>
-    <w:p/>
     <w:p>
       <w:r>
         <w:t>| Файл | Назначение |</w:t>
@@ -678,11 +622,9 @@
         <w:t>| `sites/marmara-pro/termo-seo.md` | SEO посадочной (если в репозитории) |</w:t>
       </w:r>
     </w:p>
-    <w:p/>
-    <w:p/>
     <w:p>
       <w:r>
-        <w:t>*Клиент: Marmara PRO / КлинкерПрофи · ИП Баушев Дмитрий Викторович · г. Выборг*</w:t>
+        <w:t>*Клиент: КлинкерПрофи · ИП Баушев Дмитрий Викторович · г. Выборг*</w:t>
       </w:r>
     </w:p>
     <w:sectPr>

</xml_diff>

<commit_message>
Clarify search-only CPA campaign name and UTM _search
Add Word link in spec; regenerate docx. Campaign title includes Поиск.

Co-authored-by: Igor-Lark <Igor-Lark@users.noreply.github.com>
</commit_message>
<xml_diff>
--- a/ads/marmara-pro/termopaneli-priozersky-campaign-cpa.docx
+++ b/ads/marmara-pro/termopaneli-priozersky-campaign-cpa.docx
@@ -7,12 +7,22 @@
         <w:pStyle w:val="Heading1"/>
       </w:pPr>
       <w:r>
-        <w:t>Кампания: КлинкерПрофи — термопанели, Приозерский район (CPA)</w:t>
+        <w:t>Кампания (Поиск): КлинкерПрофи — термопанели, Приозерский район (CPA)</w:t>
+      </w:r>
+    </w:p>
+    <w:p>
+      <w:r>
+        <w:t>**Word:** [`termopaneli-priozersky-campaign-cpa.docx`](termopaneli-priozersky-campaign-cpa.docx) — полная спецификация для скачивания из репозитория.</w:t>
       </w:r>
     </w:p>
     <w:p>
       <w:r>
         <w:t>Отдельная **поисковая** рекламная кампания в Яндекс Директе для фасадных термопанелей **КлинкерПрофи** с гео **только Приозерский район** Ленинградской области.</w:t>
+      </w:r>
+    </w:p>
+    <w:p>
+      <w:r>
+        <w:t>**Кампания 1 из двух:** только **Поиск** (без РСЯ). Реклама в **РСЯ** — отдельная кампания и отдельная спецификация.</w:t>
       </w:r>
     </w:p>
     <w:p>
@@ -50,7 +60,12 @@
     </w:p>
     <w:p>
       <w:r>
-        <w:t>| **Название кампании** | `КлинкерПрофи — термопанели, Приозерский район (CPA)` |</w:t>
+        <w:t>| **Название кампании** | `КлинкерПрофи — термопанели, Приозерский район (Поиск, CPA)` |</w:t>
+      </w:r>
+    </w:p>
+    <w:p>
+      <w:r>
+        <w:t>| **Места показа** | **Только Поиск** (РСЯ выключена) |</w:t>
       </w:r>
     </w:p>
     <w:p>
@@ -108,7 +123,7 @@
     </w:p>
     <w:p>
       <w:r>
-        <w:t>utm_source=yandex&amp;utm_medium=cpc&amp;utm_campaign=termopaneli_priozersk_cpa&amp;utm_content=search&amp;utm_term={keyword}</w:t>
+        <w:t>utm_source=yandex&amp;utm_medium=cpc&amp;utm_campaign=termopaneli_priozersk_cpa_search&amp;utm_content=search&amp;utm_term={keyword}</w:t>
       </w:r>
     </w:p>
     <w:p>
@@ -207,7 +222,7 @@
     </w:p>
     <w:p>
       <w:r>
-        <w:t>2. Название: `КлинкерПрофи — термопанели, Приозерский район (CPA)`.</w:t>
+        <w:t>2. Название: `КлинкерПрофи — термопанели, Приозерский район (Поиск, CPA)`.</w:t>
       </w:r>
     </w:p>
     <w:p>
@@ -333,7 +348,7 @@
     </w:p>
     <w:p>
       <w:r>
-        <w:t>2. После стабильных конверсий в Метрике (UTM `termopaneli_priozersk_cpa`) — переключить на **оплату за конверсии** с CPA из таблицы.</w:t>
+        <w:t>2. После стабильных конверсий в Метрике (UTM `termopaneli_priozersk_cpa_search`) — переключить на **оплату за конверсии** с CPA из таблицы.</w:t>
       </w:r>
     </w:p>
     <w:p>
@@ -553,7 +568,7 @@
     </w:p>
     <w:p>
       <w:r>
-        <w:t>8. **Еженедельно:** Директ → «Поисковые запросы» → минус-слова; Метрика → цели по UTM `termopaneli_priozersk_cpa`.</w:t>
+        <w:t>8. **Еженедельно:** Директ → «Поисковые запросы» → минус-слова; Метрика → цели по UTM `termopaneli_priozersk_cpa_search`.</w:t>
       </w:r>
     </w:p>
     <w:p>

</xml_diff>